<commit_message>
docs(artigo): revisado com os números atuais (11 migrações, 26 RPCs, tempo limite de 10 s)
Co-Authored-By: Claude Opus 5.5 (1M context) <noreply@anthropic.com>
</commit_message>
<xml_diff>
--- a/docs/tcc/artigo/Artigo_PEI_Vivo_v3_revisado.docx
+++ b/docs/tcc/artigo/Artigo_PEI_Vivo_v3_revisado.docx
@@ -613,7 +613,7 @@
           <w:i w:val="0"/>
           <w:sz w:val="24"/>
         </w:rPr>
-        <w:t xml:space="preserve">O Plano Educacional Individualizado (PEI) é reconhecido na literatura nacional como instrumento relevante para a inclusão escolar, mas ainda pouco operacionalizado e pouco traduzido em material didático. Este artigo técnico apresenta o PEI Vivo, sistema web que organiza um ciclo quinzenal em que docente, família e profissional de saúde registram observações em seis dimensões, um motor de regras determinísticas converte essas observações em parâmetros de adaptação, o profissional de saúde valida o conjunto de parâmetros e o docente gera, revisa e aprova o material adaptado. A pesquisa é aplicada e segue a Design Science Research. São apresentados a fundamentação teórica, a comparação com sistemas semelhantes, os requisitos, as regras de negócio, a modelagem UML e o método de avaliação. O sistema é construído em TypeScript, com interface React e banco PostgreSQL na plataforma Supabase, organizado em nove migrações com 15 tabelas, e as permissões são aplicadas pelo próprio banco, por Row Level Security e por funções que verificam papel e consentimento. Os resultados da implementação e da avaliação com usuários serão apresentados na etapa seguinte do trabalho. </w:t>
+        <w:t xml:space="preserve">O Plano Educacional Individualizado (PEI) é reconhecido na literatura nacional como instrumento relevante para a inclusão escolar, mas ainda pouco operacionalizado e pouco traduzido em material didático. Este artigo técnico apresenta o PEI Vivo, sistema web que organiza um ciclo quinzenal em que docente, família e profissional de saúde registram observações em seis dimensões, um motor de regras determinísticas converte essas observações em parâmetros de adaptação, o profissional de saúde valida o conjunto de parâmetros e o docente gera, revisa e aprova o material adaptado. A pesquisa é aplicada e segue a Design Science Research. São apresentados a fundamentação teórica, a comparação com sistemas semelhantes, os requisitos, as regras de negócio, a modelagem UML e o método de avaliação. O sistema é construído em TypeScript, com interface React e banco PostgreSQL na plataforma Supabase, organizado em onze migrações com 15 tabelas, e as permissões são aplicadas pelo próprio banco, por Row Level Security e por funções que verificam papel e consentimento. Os resultados da implementação e da avaliação com usuários serão apresentados na etapa seguinte do trabalho. </w:t>
       </w:r>
       <w:r>
         <w:rPr>
@@ -682,7 +682,7 @@
           <w:i w:val="0"/>
           <w:sz w:val="24"/>
         </w:rPr>
-        <w:t>Brazilian studies recognize the Individualized Education Plan (PEI) as a relevant instrument for school inclusion, yet it is still rarely operationalized or turned into teaching material. This technical paper presents PEI Vivo, a web system that runs a biweekly cycle in which teachers, families and health professionals record observations on six dimensions; a deterministic rule engine converts them into adaptation parameters; a health professional validates the parameter set; and the teacher generates, reviews and approves the adapted material. The research is applied and follows Design Science Research. The paper presents the theoretical background, a comparison with similar systems, requirements, business rules, UML models and evaluation method. The system is built in TypeScript with React and PostgreSQL on Supabase, organized in nine migrations with 15 tables, and permissions are enforced by the database itself through Row Level Security and functions that check role and consent. Implementation and user evaluation results will be presented in the next stage of the work.</w:t>
+        <w:t>Brazilian studies recognize the Individualized Education Plan (PEI) as a relevant instrument for school inclusion, yet it is still rarely operationalized or turned into teaching material. This technical paper presents PEI Vivo, a web system that runs a biweekly cycle in which teachers, families and health professionals record observations on six dimensions; a deterministic rule engine converts them into adaptation parameters; a health professional validates the parameter set; and the teacher generates, reviews and approves the adapted material. The research is applied and follows Design Science Research. The paper presents the theoretical background, a comparison with similar systems, requirements, business rules, UML models and evaluation method. The system is built in TypeScript with React and PostgreSQL on Supabase, organized in eleven migrations with 15 tables, and permissions are enforced by the database itself through Row Level Security and functions that check role and consent. Implementation and user evaluation results will be presented in the next stage of the work.</w:t>
       </w:r>
     </w:p>
     <w:p>
@@ -5155,7 +5155,7 @@
           <w:i w:val="0"/>
           <w:sz w:val="24"/>
         </w:rPr>
-        <w:t>O diagrama de classes define o modelo de dados do sistema e foi gerado a partir das migrações do banco (0001 a 0008; a migração 0009 altera apenas uma função e não muda o modelo), de modo que cada classe persistente corresponde a uma tabela. São 15 classes persistentes e 2 objetos de valor (ParametrosAdaptacao, com os seis parâmetros, e TextoAdaptado). Para que continue legível no papel, o diagrama foi dividido em três figuras por domínio: escola, pessoas e vínculos (Figura 1); estudante, consentimento, nota clínica e auditoria (Figura 2); e ciclo de observação, versão do perfil e material (Figura 3). Uma classe desenhada com borda tracejada é detalhada em outra figura e aparece apenas para mostrar a associação. Entre chaves estão as restrições garantidas pelo banco, como uma versão vigente por estudante, um consentimento ativo e parâmetros imutáveis. A senha e o segundo fator não aparecem porque são mantidos pelo serviço de autenticação, e não pelo esquema da aplicação. A versão integral, em uma única imagem, está no repositório (docs/tcc/class_diagram.svg).</w:t>
+        <w:t>O diagrama de classes define o modelo de dados do sistema e foi gerado a partir das migrações do banco (0001 a 0008; as migrações 0009 a 0011 acrescentam funções e restrições, sem tabelas novas), de modo que cada classe persistente corresponde a uma tabela. São 15 classes persistentes e 2 objetos de valor (ParametrosAdaptacao, com os seis parâmetros, e TextoAdaptado). Para que continue legível no papel, o diagrama foi dividido em três figuras por domínio: escola, pessoas e vínculos (Figura 1); estudante, consentimento, nota clínica e auditoria (Figura 2); e ciclo de observação, versão do perfil e material (Figura 3). Uma classe desenhada com borda tracejada é detalhada em outra figura e aparece apenas para mostrar a associação. Entre chaves estão as restrições garantidas pelo banco, como uma versão vigente por estudante, um consentimento ativo e parâmetros imutáveis. A senha e o segundo fator não aparecem porque são mantidos pelo serviço de autenticação, e não pelo esquema da aplicação. A versão integral, em uma única imagem, está no repositório (docs/tcc/class_diagram.svg).</w:t>
       </w:r>
     </w:p>
     <w:p>
@@ -8610,7 +8610,7 @@
           <w:i w:val="0"/>
           <w:sz w:val="24"/>
         </w:rPr>
-        <w:t>O banco PostgreSQL, hospedado no Supabase, foi implementado em nove migrações sequenciais, com 15 tabelas, 17 tipos enumerados, RLS habilitado em todas as tabelas e 25 funções do banco (RPCs) que concentram as escritas sensíveis. Todas as chaves primárias são do tipo UUID, toda chave estrangeira tem índice, e restrições do próprio banco garantem as regras de unicidade, como no máximo uma versão vigente e um consentimento ativo por estudante e um ciclo aberto por vez. As funções privilegiadas fixam o caminho de busca de objetos e não montam SQL dinâmico, e o cliente acessa o banco apenas por chamadas parametrizadas, o que elimina a superfície de injeção de SQL. Nenhuma política concede acesso total a uma tabela. Vínculos, consentimentos, versões de perfil, materiais e notas clínicas só são escritos por funções que verificam papel, consentimento e segundo fator quando exigido, e que registram cada operação relevante em uma tabela de auditoria que não admite alteração nem exclusão. O Quadro 8 sintetiza a matriz de permissões resultante, e o Quadro 9 lista as integrações do sistema.</w:t>
+        <w:t>O banco PostgreSQL, hospedado no Supabase, foi implementado em onze migrações sequenciais, com 15 tabelas, 17 tipos enumerados, RLS habilitado em todas as tabelas e 26 funções do banco (RPCs) que concentram as escritas sensíveis. Todas as chaves primárias são do tipo UUID, toda chave estrangeira tem índice, e restrições do próprio banco garantem as regras de unicidade, como no máximo uma versão vigente e um consentimento ativo por estudante e um ciclo aberto por vez. As funções privilegiadas fixam o caminho de busca de objetos e não montam SQL dinâmico, e o cliente acessa o banco apenas por chamadas parametrizadas, o que elimina a superfície de injeção de SQL. Nenhuma política concede acesso total a uma tabela. Vínculos, consentimentos, versões de perfil, materiais e notas clínicas só são escritos por funções que verificam papel, consentimento e segundo fator quando exigido, e que registram cada operação relevante em uma tabela de auditoria que não admite alteração nem exclusão. O Quadro 8 sintetiza a matriz de permissões resultante, e o Quadro 9 lista as integrações do sistema.</w:t>
       </w:r>
     </w:p>
     <w:p>
@@ -10029,10 +10029,10 @@
         <w:tblLook w:firstColumn="1" w:firstRow="1" w:lastColumn="0" w:lastRow="0" w:noHBand="0" w:noVBand="1" w:val="04A0"/>
       </w:tblPr>
       <w:tblGrid>
-        <w:gridCol w:w="2295"/>
-        <w:gridCol w:w="1831"/>
-        <w:gridCol w:w="1986"/>
-        <w:gridCol w:w="2958"/>
+        <w:gridCol w:w="2278"/>
+        <w:gridCol w:w="1752"/>
+        <w:gridCol w:w="1901"/>
+        <w:gridCol w:w="3138"/>
       </w:tblGrid>
       <w:tr>
         <w:trPr>
@@ -10040,7 +10040,7 @@
         </w:trPr>
         <w:tc>
           <w:tcPr>
-            <w:tcW w:type="dxa" w:w="2295"/>
+            <w:tcW w:type="dxa" w:w="2279"/>
             <w:shd w:val="clear" w:fill="E7EDF2"/>
           </w:tcPr>
           <w:p>
@@ -10062,7 +10062,7 @@
         </w:tc>
         <w:tc>
           <w:tcPr>
-            <w:tcW w:type="dxa" w:w="1831"/>
+            <w:tcW w:type="dxa" w:w="1753"/>
             <w:shd w:val="clear" w:fill="E7EDF2"/>
           </w:tcPr>
           <w:p>
@@ -10084,7 +10084,7 @@
         </w:tc>
         <w:tc>
           <w:tcPr>
-            <w:tcW w:type="dxa" w:w="1986"/>
+            <w:tcW w:type="dxa" w:w="1901"/>
             <w:shd w:val="clear" w:fill="E7EDF2"/>
           </w:tcPr>
           <w:p>
@@ -10106,7 +10106,7 @@
         </w:tc>
         <w:tc>
           <w:tcPr>
-            <w:tcW w:type="dxa" w:w="2958"/>
+            <w:tcW w:type="dxa" w:w="3138"/>
             <w:shd w:val="clear" w:fill="E7EDF2"/>
           </w:tcPr>
           <w:p>
@@ -10130,7 +10130,7 @@
       <w:tr>
         <w:tc>
           <w:tcPr>
-            <w:tcW w:type="dxa" w:w="2295"/>
+            <w:tcW w:type="dxa" w:w="2279"/>
           </w:tcPr>
           <w:p>
             <w:pPr>
@@ -10151,7 +10151,7 @@
         </w:tc>
         <w:tc>
           <w:tcPr>
-            <w:tcW w:type="dxa" w:w="1831"/>
+            <w:tcW w:type="dxa" w:w="1753"/>
           </w:tcPr>
           <w:p>
             <w:pPr>
@@ -10172,7 +10172,7 @@
         </w:tc>
         <w:tc>
           <w:tcPr>
-            <w:tcW w:type="dxa" w:w="1986"/>
+            <w:tcW w:type="dxa" w:w="1901"/>
           </w:tcPr>
           <w:p>
             <w:pPr>
@@ -10193,7 +10193,7 @@
         </w:tc>
         <w:tc>
           <w:tcPr>
-            <w:tcW w:type="dxa" w:w="2958"/>
+            <w:tcW w:type="dxa" w:w="3138"/>
           </w:tcPr>
           <w:p>
             <w:pPr>
@@ -10216,7 +10216,7 @@
       <w:tr>
         <w:tc>
           <w:tcPr>
-            <w:tcW w:type="dxa" w:w="2295"/>
+            <w:tcW w:type="dxa" w:w="2279"/>
           </w:tcPr>
           <w:p>
             <w:pPr>
@@ -10236,7 +10236,7 @@
         </w:tc>
         <w:tc>
           <w:tcPr>
-            <w:tcW w:type="dxa" w:w="1831"/>
+            <w:tcW w:type="dxa" w:w="1753"/>
           </w:tcPr>
           <w:p>
             <w:pPr>
@@ -10256,7 +10256,7 @@
         </w:tc>
         <w:tc>
           <w:tcPr>
-            <w:tcW w:type="dxa" w:w="1986"/>
+            <w:tcW w:type="dxa" w:w="1901"/>
           </w:tcPr>
           <w:p>
             <w:pPr>
@@ -10276,7 +10276,7 @@
         </w:tc>
         <w:tc>
           <w:tcPr>
-            <w:tcW w:type="dxa" w:w="2958"/>
+            <w:tcW w:type="dxa" w:w="3138"/>
           </w:tcPr>
           <w:p>
             <w:pPr>
@@ -10298,7 +10298,7 @@
       <w:tr>
         <w:tc>
           <w:tcPr>
-            <w:tcW w:type="dxa" w:w="2295"/>
+            <w:tcW w:type="dxa" w:w="2279"/>
           </w:tcPr>
           <w:p>
             <w:pPr>
@@ -10318,7 +10318,7 @@
         </w:tc>
         <w:tc>
           <w:tcPr>
-            <w:tcW w:type="dxa" w:w="1831"/>
+            <w:tcW w:type="dxa" w:w="1753"/>
           </w:tcPr>
           <w:p>
             <w:pPr>
@@ -10338,7 +10338,7 @@
         </w:tc>
         <w:tc>
           <w:tcPr>
-            <w:tcW w:type="dxa" w:w="1986"/>
+            <w:tcW w:type="dxa" w:w="1901"/>
           </w:tcPr>
           <w:p>
             <w:pPr>
@@ -10358,7 +10358,7 @@
         </w:tc>
         <w:tc>
           <w:tcPr>
-            <w:tcW w:type="dxa" w:w="2958"/>
+            <w:tcW w:type="dxa" w:w="3138"/>
           </w:tcPr>
           <w:p>
             <w:pPr>
@@ -10372,7 +10372,7 @@
                 <w:i w:val="0"/>
                 <w:sz w:val="20"/>
               </w:rPr>
-              <w:t>Corpo de erro padronizado; erro inesperado sem detalhe interno</w:t>
+              <w:t>Corpo de erro padronizado; erro inesperado sem detalhe interno; tempo limite de 10 s nas chamadas ao banco e ao Auth</w:t>
             </w:r>
           </w:p>
         </w:tc>
@@ -10380,7 +10380,7 @@
       <w:tr>
         <w:tc>
           <w:tcPr>
-            <w:tcW w:type="dxa" w:w="2295"/>
+            <w:tcW w:type="dxa" w:w="2279"/>
           </w:tcPr>
           <w:p>
             <w:pPr>
@@ -10400,7 +10400,7 @@
         </w:tc>
         <w:tc>
           <w:tcPr>
-            <w:tcW w:type="dxa" w:w="1831"/>
+            <w:tcW w:type="dxa" w:w="1753"/>
           </w:tcPr>
           <w:p>
             <w:pPr>
@@ -10420,7 +10420,7 @@
         </w:tc>
         <w:tc>
           <w:tcPr>
-            <w:tcW w:type="dxa" w:w="1986"/>
+            <w:tcW w:type="dxa" w:w="1901"/>
           </w:tcPr>
           <w:p>
             <w:pPr>
@@ -10440,7 +10440,7 @@
         </w:tc>
         <w:tc>
           <w:tcPr>
-            <w:tcW w:type="dxa" w:w="2958"/>
+            <w:tcW w:type="dxa" w:w="3138"/>
           </w:tcPr>
           <w:p>
             <w:pPr>
@@ -10462,7 +10462,7 @@
       <w:tr>
         <w:tc>
           <w:tcPr>
-            <w:tcW w:type="dxa" w:w="2295"/>
+            <w:tcW w:type="dxa" w:w="2279"/>
           </w:tcPr>
           <w:p>
             <w:pPr>
@@ -10482,7 +10482,7 @@
         </w:tc>
         <w:tc>
           <w:tcPr>
-            <w:tcW w:type="dxa" w:w="1831"/>
+            <w:tcW w:type="dxa" w:w="1753"/>
           </w:tcPr>
           <w:p>
             <w:pPr>
@@ -10502,7 +10502,7 @@
         </w:tc>
         <w:tc>
           <w:tcPr>
-            <w:tcW w:type="dxa" w:w="1986"/>
+            <w:tcW w:type="dxa" w:w="1901"/>
           </w:tcPr>
           <w:p>
             <w:pPr>
@@ -10522,7 +10522,7 @@
         </w:tc>
         <w:tc>
           <w:tcPr>
-            <w:tcW w:type="dxa" w:w="2958"/>
+            <w:tcW w:type="dxa" w:w="3138"/>
           </w:tcPr>
           <w:p>
             <w:pPr>
@@ -10544,7 +10544,7 @@
       <w:tr>
         <w:tc>
           <w:tcPr>
-            <w:tcW w:type="dxa" w:w="2295"/>
+            <w:tcW w:type="dxa" w:w="2279"/>
           </w:tcPr>
           <w:p>
             <w:pPr>
@@ -10564,7 +10564,7 @@
         </w:tc>
         <w:tc>
           <w:tcPr>
-            <w:tcW w:type="dxa" w:w="1831"/>
+            <w:tcW w:type="dxa" w:w="1753"/>
           </w:tcPr>
           <w:p>
             <w:pPr>
@@ -10584,7 +10584,7 @@
         </w:tc>
         <w:tc>
           <w:tcPr>
-            <w:tcW w:type="dxa" w:w="1986"/>
+            <w:tcW w:type="dxa" w:w="1901"/>
           </w:tcPr>
           <w:p>
             <w:pPr>
@@ -10604,7 +10604,7 @@
         </w:tc>
         <w:tc>
           <w:tcPr>
-            <w:tcW w:type="dxa" w:w="2958"/>
+            <w:tcW w:type="dxa" w:w="3138"/>
           </w:tcPr>
           <w:p>
             <w:pPr>
@@ -11107,7 +11107,7 @@
           <w:i w:val="0"/>
           <w:sz w:val="24"/>
         </w:rPr>
-        <w:t>O primeiro é a verificação técnica automatizada, organizada em cinco níveis. (i) Testes unitários do motor de adaptação, funções puras sem banco nem rede, cobrindo a assimetria da RN03 em todos os parâmetros. (ii) Testes unitários dos casos de uso das Edge Functions, com o banco, o serviço de autenticação e o provedor de IA substituídos por dublês, em cinco cenários para cada integração: sucesso, falha do serviço, tempo esgotado, carga inválida e dado duplicado; a camada HTTP comum às três funções é testada com o ambiente de execução simulado, cobrindo método, autenticação, corpo inválido e resposta de erro sem detalhe interno. (iii) Testes de integração com o banco, que aplicam as nove migrações e o cenário fictício no PGlite e tentam, para cada regra de acesso, primeiro o acesso negado (por exemplo, um docente lendo nota clínica pela API) e só depois o caminho permitido; uma sonda de 31 tentativas de acesso indevido, construída a partir da matriz de permissões, foi executada contra as políticas de cada versão. (iv) Testes de contrato com o Supabase real, executados no GitHub Actions a cada alteração: o job aplica as migrações em uma instância do Supabase, sobe as Edge Functions e repete os testes de política por HTTP, com login, segundo fator TOTP e o ciclo completo pela camada de serviços da interface. (v) Testes ponta a ponta em navegador, nas larguras de 390 e 1280 pixels, com axe-core verificando o contraste real; as páginas públicas foram medidas com Lighthouse. As verificações que dependem de credenciais de produção não são executadas nos testes, que usam apenas dados fictícios.</w:t>
+        <w:t>O primeiro é a verificação técnica automatizada, organizada em cinco níveis. (i) Testes unitários do motor de adaptação, funções puras sem banco nem rede, cobrindo a assimetria da RN03 em todos os parâmetros. (ii) Testes unitários dos casos de uso das Edge Functions, com o banco, o serviço de autenticação e o provedor de IA substituídos por dublês, em cinco cenários para cada integração: sucesso, falha do serviço, tempo esgotado, carga inválida e dado duplicado; a camada HTTP comum às três funções é testada com o ambiente de execução simulado, cobrindo método, autenticação, corpo inválido e resposta de erro sem detalhe interno. (iii) Testes de integração com o banco, que aplicam as onze migrações e o cenário fictício no PGlite e tentam, para cada regra de acesso, primeiro o acesso negado (por exemplo, um docente lendo nota clínica pela API) e só depois o caminho permitido; uma sonda de 31 tentativas de acesso indevido, construída a partir da matriz de permissões, foi executada contra as políticas de cada versão. (iv) Testes de contrato com o Supabase real, executados no GitHub Actions a cada alteração: o job aplica as migrações em uma instância do Supabase, sobe as Edge Functions e repete os testes de política por HTTP, com login, segundo fator TOTP e o ciclo completo pela camada de serviços da interface. (v) Testes ponta a ponta em navegador, nas larguras de 390 e 1280 pixels, com axe-core verificando o contraste real; as páginas públicas foram medidas com Lighthouse. As verificações que dependem de credenciais de produção não são executadas nos testes, que usam apenas dados fictícios.</w:t>
       </w:r>
     </w:p>
     <w:p>

</xml_diff>